<commit_message>
Single positive verbs and no vague quantifiers across all 11 pages
Follows the user's predicate standard: no phrasal predicates (lets, make up,
round out, break down into, fall into, account for), and no "most", "about"
or "roughly". IPP bans exact stock counts, so quantifiers became verbs
(leads, dominates), the named units, or an exact proportion. Also varies the
cross-page frames still left on the pilot and in the condition tabs
("Good used X make up most of IPP's inventory").

Co-Authored-By: Claude Opus 5.5 <noreply@anthropic.com>
</commit_message>
<xml_diff>
--- a/docs/new-pages-for-review/decanter-centrifuge-parts.docx
+++ b/docs/new-pages-for-review/decanter-centrifuge-parts.docx
@@ -12,7 +12,7 @@
     </w:p>
     <w:p>
       <w:r>
-        <w:t>Buying used decanter centrifuge parts through International Process Plants (IPP) supplies plant engineering teams with scroll conveyors, rotating assemblies and a gearbox for Sharples, Alfa Laval, Dorr Oliver, Sangerhausen and Bird solid bowl decanter centrifuges. Most parts are stainless steel 316, and the conveyors carry hard-surfaced flights. Buying used saves up to 50% of capital and 90% of lead time versus buying new, and IPP has supplied process equipment worldwide since 1980.</w:t>
+        <w:t>Buying used decanter centrifuge parts through International Process Plants (IPP) supplies plant engineering teams with scroll conveyors, rotating assemblies and a gearbox for Sharples, Alfa Laval, Dorr Oliver, Sangerhausen and Bird solid bowl decanter centrifuges. Stainless steel 316 covers the Dorr Oliver, Sharples P3400 and P-2000, and Sangerhausen parts, and the conveyors carry hard-surfaced flights. Buying used saves up to 50% of capital and 90% of lead time versus buying new, and IPP has supplied process equipment worldwide since 1980.</w:t>
       </w:r>
     </w:p>
     <w:p>
@@ -140,7 +140,7 @@
     </w:p>
     <w:p>
       <w:r>
-        <w:t>Scroll conveyors, rotating assemblies and gearboxes make up the part types in stock.</w:t>
+        <w:t>The part types in stock span scroll conveyors, rotating assemblies and gearboxes.</w:t>
       </w:r>
     </w:p>
     <w:p>
@@ -213,7 +213,7 @@
     </w:p>
     <w:p>
       <w:r>
-        <w:t>Parts range from a gearbox and scroll conveyors to complete rotating assemblies, most in stainless steel 316.</w:t>
+        <w:t>Parts range from a gearbox and scroll conveyors to complete rotating assemblies, with stainless steel 316 the leading material.</w:t>
       </w:r>
     </w:p>
     <w:p>
@@ -701,7 +701,7 @@
           <w:p>
             <w:r/>
             <w:r>
-              <w:t>Stainless steel 316 on most parts</w:t>
+              <w:t>Stainless steel 316 on the Dorr Oliver, Sharples and Sangerhausen parts</w:t>
             </w:r>
           </w:p>
         </w:tc>
@@ -782,7 +782,7 @@
         <w:t>Q: What decanter centrifuge parts does IPP stock?</w:t>
       </w:r>
       <w:r>
-        <w:t xml:space="preserve"> A: Scroll conveyors, rotating assemblies and a gearbox for Sharples, Alfa Laval, Dorr Oliver, Sangerhausen and Bird machines make up IPP's good used decanter centrifuge parts. IMS carries the current list.</w:t>
+        <w:t xml:space="preserve"> A: Good used scroll conveyors, rotating assemblies and a gearbox fit Sharples, Alfa Laval, Dorr Oliver, Sangerhausen and Bird machines. IMS carries the current list.</w:t>
       </w:r>
     </w:p>
     <w:p>

</xml_diff>

<commit_message>
Batch 3 (P11-15): five dryer pages; new hero opener on every page
New pages (review drafts, routed in vercel.json):
- /equipment/dryer/rotary-hot-air-dryer/
- /equipment/dryer/shelf-dryer/
- /equipment/dryer/thin-film-dryer/
- /equipment/dryer/thermal-disc-dryer/
- /equipment/dryer/spherical-dryer/
with IMS data, client-review .md and review .docx for each.

Hero opener: every page (pilot and batches 1-2 included) now opens
"Buying [conditions] [product] from International Process Plants (IPP)
[verb] [three functions] while [verb]ing issues like [two buying
problems]." Each page has its own verbs and issue pair. Shared
cross-page frames reworded; review docs re-issued.

Co-Authored-By: Claude Opus 5.5 <noreply@anthropic.com>
</commit_message>
<xml_diff>
--- a/docs/new-pages-for-review/decanter-centrifuge-parts.docx
+++ b/docs/new-pages-for-review/decanter-centrifuge-parts.docx
@@ -12,7 +12,7 @@
     </w:p>
     <w:p>
       <w:r>
-        <w:t>Buying used decanter centrifuge parts through International Process Plants (IPP) supplies plant engineering teams with scroll conveyors, rotating assemblies and a gearbox for Sharples, Alfa Laval, Dorr Oliver, Sangerhausen and Bird solid bowl decanter centrifuges. Stainless steel 316 covers the Dorr Oliver, Sharples P3400 and P-2000, and Sangerhausen parts, and the conveyors carry hard-surfaced flights. Buying used saves up to 50% of capital and 90% of lead time versus buying new, and IPP has supplied process equipment worldwide since 1980.</w:t>
+        <w:t>Buying good used decanter centrifuge parts from International Process Plants (IPP) restores scroll conveyors, rotating assemblies, and gearboxes on Sharples, Alfa Laval, Dorr Oliver, Sangerhausen, and Bird decanters while clearing issues like long OEM part lead times and new-part costs. Plant engineering teams running solid bowl decanter centrifuges buy them straight from stock. Stainless steel 316 covers the Dorr Oliver, Sharples P3400 and P-2000, and Sangerhausen parts, and the conveyors carry hard-surfaced flights. Buying used saves up to 50% of capital and 90% of lead time versus buying new, and IPP has supplied process equipment worldwide since 1980.</w:t>
       </w:r>
     </w:p>
     <w:p>
@@ -239,7 +239,7 @@
     </w:p>
     <w:p>
       <w:r>
-        <w:t>IPP lists decanter centrifuge parts in good used condition. Each IMS listing states the condition grade alongside the part's description.</w:t>
+        <w:t>IPP lists decanter centrifuge parts in good used condition. IMS shows the grade next to each part's description.</w:t>
       </w:r>
     </w:p>
     <w:p>
@@ -804,7 +804,7 @@
         <w:t>Q: What condition are the parts in?</w:t>
       </w:r>
       <w:r>
-        <w:t xml:space="preserve"> A: IPP's decanter centrifuge parts are good used, each IMS listing stating its condition grade. The listings record features such as hard-surfaced conveyor flights and which assembly includes a gearbox.</w:t>
+        <w:t xml:space="preserve"> A: IPP's decanter centrifuge parts are good used, with the condition grade printed on IMS. The listings record features such as hard-surfaced conveyor flights and which assembly includes a gearbox.</w:t>
       </w:r>
     </w:p>
     <w:p>

</xml_diff>